<commit_message>
DIP-21: Add UX wireframes, competitor evidence and fix READMEs
</commit_message>
<xml_diff>
--- a/docs/existing-system-comparison.docx
+++ b/docs/existing-system-comparison.docx
@@ -2740,7 +2740,7 @@
           <w:sz w:val="28"/>
           <w:szCs w:val="28"/>
         </w:rPr>
-        <w:t xml:space="preserve">5. Evidence Still to Collect</w:t>
+        <w:t xml:space="preserve">5. Collected Evidence</w:t>
       </w:r>
     </w:p>
     <w:p>
@@ -2756,7 +2756,431 @@
           <w:sz w:val="24"/>
           <w:szCs w:val="24"/>
         </w:rPr>
-        <w:t xml:space="preserve">Before the pre-defense, the team should install Wanderlog, TripIt, Mindtrip and Splitwise (and open Tripadvisor Trips), try to plan a trip to Astana, and save screenshots to docs/evidence/. The screenshots should confirm or correct every "Not stated" cell and show how each application handles Astana (whether it suggests places, in which language, and whether local events appear).</w:t>
+        <w:t xml:space="preserve">On 21 October 2026 the team opened two additional AI trip planners that are very close to our idea and saved screenshots in docs/evidence/. They are not part of Table 1 (which is limited to five systems) but they confirm the trend described in Section 4.</w:t>
+      </w:r>
+    </w:p>
+    <w:tbl>
+      <w:tblPr>
+        <w:tblW w:type="dxa" w:w="9026"/>
+        <w:tblBorders>
+          <w:top w:val="single" w:color="auto" w:sz="4"/>
+          <w:left w:val="single" w:color="auto" w:sz="4"/>
+          <w:bottom w:val="single" w:color="auto" w:sz="4"/>
+          <w:right w:val="single" w:color="auto" w:sz="4"/>
+          <w:insideH w:val="single" w:color="auto" w:sz="4"/>
+          <w:insideV w:val="single" w:color="auto" w:sz="4"/>
+        </w:tblBorders>
+      </w:tblPr>
+      <w:tblGrid>
+        <w:gridCol w:w="2100"/>
+        <w:gridCol w:w="3300"/>
+        <w:gridCol w:w="3626"/>
+      </w:tblGrid>
+      <w:tr>
+        <w:trPr>
+          <w:cantSplit/>
+          <w:tblHeader/>
+        </w:trPr>
+        <w:tc>
+          <w:tcPr>
+            <w:tcW w:type="dxa" w:w="2100"/>
+            <w:tcBorders>
+              <w:top w:val="single" w:color="000000" w:sz="4"/>
+              <w:left w:val="single" w:color="000000" w:sz="4"/>
+              <w:bottom w:val="single" w:color="000000" w:sz="4"/>
+              <w:right w:val="single" w:color="000000" w:sz="4"/>
+            </w:tcBorders>
+            <w:tcMar>
+              <w:top w:type="dxa" w:w="50"/>
+              <w:left w:type="dxa" w:w="80"/>
+              <w:bottom w:type="dxa" w:w="50"/>
+              <w:right w:type="dxa" w:w="80"/>
+            </w:tcMar>
+          </w:tcPr>
+          <w:p>
+            <w:r>
+              <w:rPr>
+                <w:rFonts w:ascii="Times New Roman" w:cs="Times New Roman" w:eastAsia="Times New Roman" w:hAnsi="Times New Roman"/>
+                <w:b/>
+                <w:bCs/>
+                <w:sz w:val="18"/>
+                <w:szCs w:val="18"/>
+              </w:rPr>
+              <w:t xml:space="preserve">Screenshot</w:t>
+            </w:r>
+          </w:p>
+        </w:tc>
+        <w:tc>
+          <w:tcPr>
+            <w:tcW w:type="dxa" w:w="3300"/>
+            <w:tcBorders>
+              <w:top w:val="single" w:color="000000" w:sz="4"/>
+              <w:left w:val="single" w:color="000000" w:sz="4"/>
+              <w:bottom w:val="single" w:color="000000" w:sz="4"/>
+              <w:right w:val="single" w:color="000000" w:sz="4"/>
+            </w:tcBorders>
+            <w:tcMar>
+              <w:top w:type="dxa" w:w="50"/>
+              <w:left w:type="dxa" w:w="80"/>
+              <w:bottom w:type="dxa" w:w="50"/>
+              <w:right w:type="dxa" w:w="80"/>
+            </w:tcMar>
+          </w:tcPr>
+          <w:p>
+            <w:r>
+              <w:rPr>
+                <w:rFonts w:ascii="Times New Roman" w:cs="Times New Roman" w:eastAsia="Times New Roman" w:hAnsi="Times New Roman"/>
+                <w:b/>
+                <w:bCs/>
+                <w:sz w:val="18"/>
+                <w:szCs w:val="18"/>
+              </w:rPr>
+              <w:t xml:space="preserve">What it shows</w:t>
+            </w:r>
+          </w:p>
+        </w:tc>
+        <w:tc>
+          <w:tcPr>
+            <w:tcW w:type="dxa" w:w="3626"/>
+            <w:tcBorders>
+              <w:top w:val="single" w:color="000000" w:sz="4"/>
+              <w:left w:val="single" w:color="000000" w:sz="4"/>
+              <w:bottom w:val="single" w:color="000000" w:sz="4"/>
+              <w:right w:val="single" w:color="000000" w:sz="4"/>
+            </w:tcBorders>
+            <w:tcMar>
+              <w:top w:type="dxa" w:w="50"/>
+              <w:left w:type="dxa" w:w="80"/>
+              <w:bottom w:type="dxa" w:w="50"/>
+              <w:right w:type="dxa" w:w="80"/>
+            </w:tcMar>
+          </w:tcPr>
+          <w:p>
+            <w:r>
+              <w:rPr>
+                <w:rFonts w:ascii="Times New Roman" w:cs="Times New Roman" w:eastAsia="Times New Roman" w:hAnsi="Times New Roman"/>
+                <w:b/>
+                <w:bCs/>
+                <w:sz w:val="18"/>
+                <w:szCs w:val="18"/>
+              </w:rPr>
+              <w:t xml:space="preserve">Conclusion for our project</w:t>
+            </w:r>
+          </w:p>
+        </w:tc>
+      </w:tr>
+      <w:tr>
+        <w:trPr>
+          <w:cantSplit/>
+          <w:tblHeader w:val="false"/>
+        </w:trPr>
+        <w:tc>
+          <w:tcPr>
+            <w:tcW w:type="dxa" w:w="2100"/>
+            <w:tcBorders>
+              <w:top w:val="single" w:color="000000" w:sz="4"/>
+              <w:left w:val="single" w:color="000000" w:sz="4"/>
+              <w:bottom w:val="single" w:color="000000" w:sz="4"/>
+              <w:right w:val="single" w:color="000000" w:sz="4"/>
+            </w:tcBorders>
+            <w:tcMar>
+              <w:top w:type="dxa" w:w="50"/>
+              <w:left w:type="dxa" w:w="80"/>
+              <w:bottom w:type="dxa" w:w="50"/>
+              <w:right w:type="dxa" w:w="80"/>
+            </w:tcMar>
+          </w:tcPr>
+          <w:p>
+            <w:r>
+              <w:rPr>
+                <w:rFonts w:ascii="Times New Roman" w:cs="Times New Roman" w:eastAsia="Times New Roman" w:hAnsi="Times New Roman"/>
+                <w:b w:val="false"/>
+                <w:bCs w:val="false"/>
+                <w:sz w:val="18"/>
+                <w:szCs w:val="18"/>
+              </w:rPr>
+              <w:t xml:space="preserve">wonderplan-input-form.png</w:t>
+            </w:r>
+          </w:p>
+        </w:tc>
+        <w:tc>
+          <w:tcPr>
+            <w:tcW w:type="dxa" w:w="3300"/>
+            <w:tcBorders>
+              <w:top w:val="single" w:color="000000" w:sz="4"/>
+              <w:left w:val="single" w:color="000000" w:sz="4"/>
+              <w:bottom w:val="single" w:color="000000" w:sz="4"/>
+              <w:right w:val="single" w:color="000000" w:sz="4"/>
+            </w:tcBorders>
+            <w:tcMar>
+              <w:top w:type="dxa" w:w="50"/>
+              <w:left w:type="dxa" w:w="80"/>
+              <w:bottom w:type="dxa" w:w="50"/>
+              <w:right w:type="dxa" w:w="80"/>
+            </w:tcMar>
+          </w:tcPr>
+          <w:p>
+            <w:r>
+              <w:rPr>
+                <w:rFonts w:ascii="Times New Roman" w:cs="Times New Roman" w:eastAsia="Times New Roman" w:hAnsi="Times New Roman"/>
+                <w:b w:val="false"/>
+                <w:bCs w:val="false"/>
+                <w:sz w:val="18"/>
+                <w:szCs w:val="18"/>
+              </w:rPr>
+              <w:t xml:space="preserve">Wonderplan: the user describes the dream trip in free text and presses "Generate with AI", or customizes the trip manually.</w:t>
+            </w:r>
+          </w:p>
+        </w:tc>
+        <w:tc>
+          <w:tcPr>
+            <w:tcW w:type="dxa" w:w="3626"/>
+            <w:tcBorders>
+              <w:top w:val="single" w:color="000000" w:sz="4"/>
+              <w:left w:val="single" w:color="000000" w:sz="4"/>
+              <w:bottom w:val="single" w:color="000000" w:sz="4"/>
+              <w:right w:val="single" w:color="000000" w:sz="4"/>
+            </w:tcBorders>
+            <w:tcMar>
+              <w:top w:type="dxa" w:w="50"/>
+              <w:left w:type="dxa" w:w="80"/>
+              <w:bottom w:type="dxa" w:w="50"/>
+              <w:right w:type="dxa" w:w="80"/>
+            </w:tcMar>
+          </w:tcPr>
+          <w:p>
+            <w:r>
+              <w:rPr>
+                <w:rFonts w:ascii="Times New Roman" w:cs="Times New Roman" w:eastAsia="Times New Roman" w:hAnsi="Times New Roman"/>
+                <w:b w:val="false"/>
+                <w:bCs w:val="false"/>
+                <w:sz w:val="18"/>
+                <w:szCs w:val="18"/>
+              </w:rPr>
+              <w:t xml:space="preserve">Free-text AI input is becoming standard; our form (S3) combines structured fields (dates, travelers, budget) with the AI assistant for free-text changes.</w:t>
+            </w:r>
+          </w:p>
+        </w:tc>
+      </w:tr>
+      <w:tr>
+        <w:trPr>
+          <w:cantSplit/>
+          <w:tblHeader w:val="false"/>
+        </w:trPr>
+        <w:tc>
+          <w:tcPr>
+            <w:tcW w:type="dxa" w:w="2100"/>
+            <w:tcBorders>
+              <w:top w:val="single" w:color="000000" w:sz="4"/>
+              <w:left w:val="single" w:color="000000" w:sz="4"/>
+              <w:bottom w:val="single" w:color="000000" w:sz="4"/>
+              <w:right w:val="single" w:color="000000" w:sz="4"/>
+            </w:tcBorders>
+            <w:tcMar>
+              <w:top w:type="dxa" w:w="50"/>
+              <w:left w:type="dxa" w:w="80"/>
+              <w:bottom w:type="dxa" w:w="50"/>
+              <w:right w:type="dxa" w:w="80"/>
+            </w:tcMar>
+          </w:tcPr>
+          <w:p>
+            <w:r>
+              <w:rPr>
+                <w:rFonts w:ascii="Times New Roman" w:cs="Times New Roman" w:eastAsia="Times New Roman" w:hAnsi="Times New Roman"/>
+                <w:b w:val="false"/>
+                <w:bCs w:val="false"/>
+                <w:sz w:val="18"/>
+                <w:szCs w:val="18"/>
+              </w:rPr>
+              <w:t xml:space="preserve">wonderplan-attractions-rome.png</w:t>
+            </w:r>
+          </w:p>
+        </w:tc>
+        <w:tc>
+          <w:tcPr>
+            <w:tcW w:type="dxa" w:w="3300"/>
+            <w:tcBorders>
+              <w:top w:val="single" w:color="000000" w:sz="4"/>
+              <w:left w:val="single" w:color="000000" w:sz="4"/>
+              <w:bottom w:val="single" w:color="000000" w:sz="4"/>
+              <w:right w:val="single" w:color="000000" w:sz="4"/>
+            </w:tcBorders>
+            <w:tcMar>
+              <w:top w:type="dxa" w:w="50"/>
+              <w:left w:type="dxa" w:w="80"/>
+              <w:bottom w:type="dxa" w:w="50"/>
+              <w:right w:type="dxa" w:w="80"/>
+            </w:tcMar>
+          </w:tcPr>
+          <w:p>
+            <w:r>
+              <w:rPr>
+                <w:rFonts w:ascii="Times New Roman" w:cs="Times New Roman" w:eastAsia="Times New Roman" w:hAnsi="Times New Roman"/>
+                <w:b w:val="false"/>
+                <w:bCs w:val="false"/>
+                <w:sz w:val="18"/>
+                <w:szCs w:val="18"/>
+              </w:rPr>
+              <w:t xml:space="preserve">Wonderplan: a catalogue of bookable tours and activities with categories, ratings and duration (example: Rome).</w:t>
+            </w:r>
+          </w:p>
+        </w:tc>
+        <w:tc>
+          <w:tcPr>
+            <w:tcW w:type="dxa" w:w="3626"/>
+            <w:tcBorders>
+              <w:top w:val="single" w:color="000000" w:sz="4"/>
+              <w:left w:val="single" w:color="000000" w:sz="4"/>
+              <w:bottom w:val="single" w:color="000000" w:sz="4"/>
+              <w:right w:val="single" w:color="000000" w:sz="4"/>
+            </w:tcBorders>
+            <w:tcMar>
+              <w:top w:type="dxa" w:w="50"/>
+              <w:left w:type="dxa" w:w="80"/>
+              <w:bottom w:type="dxa" w:w="50"/>
+              <w:right w:type="dxa" w:w="80"/>
+            </w:tcMar>
+          </w:tcPr>
+          <w:p>
+            <w:r>
+              <w:rPr>
+                <w:rFonts w:ascii="Times New Roman" w:cs="Times New Roman" w:eastAsia="Times New Roman" w:hAnsi="Times New Roman"/>
+                <w:b w:val="false"/>
+                <w:bCs w:val="false"/>
+                <w:sz w:val="18"/>
+                <w:szCs w:val="18"/>
+              </w:rPr>
+              <w:t xml:space="preserve">Competitors monetize through bookable tours in large tourist cities; local Astana content is not shown. Our app focuses on verified local places.</w:t>
+            </w:r>
+          </w:p>
+        </w:tc>
+      </w:tr>
+      <w:tr>
+        <w:trPr>
+          <w:cantSplit/>
+          <w:tblHeader w:val="false"/>
+        </w:trPr>
+        <w:tc>
+          <w:tcPr>
+            <w:tcW w:type="dxa" w:w="2100"/>
+            <w:tcBorders>
+              <w:top w:val="single" w:color="000000" w:sz="4"/>
+              <w:left w:val="single" w:color="000000" w:sz="4"/>
+              <w:bottom w:val="single" w:color="000000" w:sz="4"/>
+              <w:right w:val="single" w:color="000000" w:sz="4"/>
+            </w:tcBorders>
+            <w:tcMar>
+              <w:top w:type="dxa" w:w="50"/>
+              <w:left w:type="dxa" w:w="80"/>
+              <w:bottom w:type="dxa" w:w="50"/>
+              <w:right w:type="dxa" w:w="80"/>
+            </w:tcMar>
+          </w:tcPr>
+          <w:p>
+            <w:r>
+              <w:rPr>
+                <w:rFonts w:ascii="Times New Roman" w:cs="Times New Roman" w:eastAsia="Times New Roman" w:hAnsi="Times New Roman"/>
+                <w:b w:val="false"/>
+                <w:bCs w:val="false"/>
+                <w:sz w:val="18"/>
+                <w:szCs w:val="18"/>
+              </w:rPr>
+              <w:t xml:space="preserve">layla-trip-checklist.png</w:t>
+            </w:r>
+          </w:p>
+        </w:tc>
+        <w:tc>
+          <w:tcPr>
+            <w:tcW w:type="dxa" w:w="3300"/>
+            <w:tcBorders>
+              <w:top w:val="single" w:color="000000" w:sz="4"/>
+              <w:left w:val="single" w:color="000000" w:sz="4"/>
+              <w:bottom w:val="single" w:color="000000" w:sz="4"/>
+              <w:right w:val="single" w:color="000000" w:sz="4"/>
+            </w:tcBorders>
+            <w:tcMar>
+              <w:top w:type="dxa" w:w="50"/>
+              <w:left w:type="dxa" w:w="80"/>
+              <w:bottom w:type="dxa" w:w="50"/>
+              <w:right w:type="dxa" w:w="80"/>
+            </w:tcMar>
+          </w:tcPr>
+          <w:p>
+            <w:r>
+              <w:rPr>
+                <w:rFonts w:ascii="Times New Roman" w:cs="Times New Roman" w:eastAsia="Times New Roman" w:hAnsi="Times New Roman"/>
+                <w:b w:val="false"/>
+                <w:bCs w:val="false"/>
+                <w:sz w:val="18"/>
+                <w:szCs w:val="18"/>
+              </w:rPr>
+              <w:t xml:space="preserve">Layla: chat-based planning with a checklist of five items (where to, where from, who is coming, when, what you are after) before generating the trip. The tenge currency can be selected.</w:t>
+            </w:r>
+          </w:p>
+        </w:tc>
+        <w:tc>
+          <w:tcPr>
+            <w:tcW w:type="dxa" w:w="3626"/>
+            <w:tcBorders>
+              <w:top w:val="single" w:color="000000" w:sz="4"/>
+              <w:left w:val="single" w:color="000000" w:sz="4"/>
+              <w:bottom w:val="single" w:color="000000" w:sz="4"/>
+              <w:right w:val="single" w:color="000000" w:sz="4"/>
+            </w:tcBorders>
+            <w:tcMar>
+              <w:top w:type="dxa" w:w="50"/>
+              <w:left w:type="dxa" w:w="80"/>
+              <w:bottom w:type="dxa" w:w="50"/>
+              <w:right w:type="dxa" w:w="80"/>
+            </w:tcMar>
+          </w:tcPr>
+          <w:p>
+            <w:r>
+              <w:rPr>
+                <w:rFonts w:ascii="Times New Roman" w:cs="Times New Roman" w:eastAsia="Times New Roman" w:hAnsi="Times New Roman"/>
+                <w:b w:val="false"/>
+                <w:bCs w:val="false"/>
+                <w:sz w:val="18"/>
+                <w:szCs w:val="18"/>
+              </w:rPr>
+              <w:t xml:space="preserve">Chat-first planning confirms the value of an AI assistant; the checklist has no explicit budget step and no group voting, which our app provides.</w:t>
+            </w:r>
+          </w:p>
+        </w:tc>
+      </w:tr>
+    </w:tbl>
+    <w:p/>
+    <w:p>
+      <w:pPr>
+        <w:pStyle w:val="Heading1"/>
+        <w:keepNext/>
+        <w:spacing w:after="120" w:before="240"/>
+      </w:pPr>
+      <w:r>
+        <w:rPr>
+          <w:rFonts w:ascii="Times New Roman" w:cs="Times New Roman" w:eastAsia="Times New Roman" w:hAnsi="Times New Roman"/>
+          <w:b/>
+          <w:bCs/>
+          <w:sz w:val="28"/>
+          <w:szCs w:val="28"/>
+        </w:rPr>
+        <w:t xml:space="preserve">6. Evidence Still to Collect</w:t>
+      </w:r>
+    </w:p>
+    <w:p>
+      <w:pPr>
+        <w:spacing w:after="120" w:line="300"/>
+        <w:jc w:val="both"/>
+      </w:pPr>
+      <w:r>
+        <w:rPr>
+          <w:rFonts w:ascii="Times New Roman" w:cs="Times New Roman" w:eastAsia="Times New Roman" w:hAnsi="Times New Roman"/>
+          <w:b w:val="false"/>
+          <w:bCs w:val="false"/>
+          <w:sz w:val="24"/>
+          <w:szCs w:val="24"/>
+        </w:rPr>
+        <w:t xml:space="preserve">The screenshots above show mainly the input screens. The generated plans for a 3-day trip to Astana should be added as well. Before the pre-defense, the team should also install Wanderlog, TripIt, Mindtrip and Splitwise (and open Tripadvisor Trips), try to plan a trip to Astana, and save screenshots to docs/evidence/. The screenshots should confirm or correct every "Not stated" cell and show how each application handles Astana (whether it suggests places, in which language, and whether local events appear).</w:t>
       </w:r>
     </w:p>
     <w:p>

</xml_diff>

<commit_message>
DIP-50: Update risks, milestones and existing system comparison
</commit_message>
<xml_diff>
--- a/docs/existing-system-comparison.docx
+++ b/docs/existing-system-comparison.docx
@@ -90,6 +90,42 @@
           <w:szCs w:val="24"/>
         </w:rPr>
         <w:t xml:space="preserve">Aigerim Kydyrbekova</w:t>
+      </w:r>
+    </w:p>
+    <w:p>
+      <w:pPr>
+        <w:spacing w:after="120" w:line="300"/>
+        <w:jc w:val="both"/>
+      </w:pPr>
+      <w:r>
+        <w:rPr>
+          <w:rFonts w:ascii="Times New Roman" w:cs="Times New Roman" w:eastAsia="Times New Roman" w:hAnsi="Times New Roman"/>
+          <w:b w:val="false"/>
+          <w:bCs w:val="false"/>
+          <w:sz w:val="24"/>
+          <w:szCs w:val="24"/>
+        </w:rPr>
+        <w:t xml:space="preserve"/>
+      </w:r>
+      <w:r>
+        <w:rPr>
+          <w:rFonts w:ascii="Times New Roman" w:cs="Times New Roman" w:eastAsia="Times New Roman" w:hAnsi="Times New Roman"/>
+          <w:b/>
+          <w:bCs/>
+          <w:sz w:val="24"/>
+          <w:szCs w:val="24"/>
+        </w:rPr>
+        <w:t xml:space="preserve">Revision:</w:t>
+      </w:r>
+      <w:r>
+        <w:rPr>
+          <w:rFonts w:ascii="Times New Roman" w:cs="Times New Roman" w:eastAsia="Times New Roman" w:hAnsi="Times New Roman"/>
+          <w:b w:val="false"/>
+          <w:bCs w:val="false"/>
+          <w:sz w:val="24"/>
+          <w:szCs w:val="24"/>
+        </w:rPr>
+        <w:t xml:space="preserve"> 24 October 2026. The "Our app" column reflects the five-outcome MVP that follows the supervisor's feedback; deferred features are marked as such.</w:t>
       </w:r>
     </w:p>
     <w:p>
@@ -1600,7 +1636,7 @@
                 <w:sz w:val="17"/>
                 <w:szCs w:val="17"/>
               </w:rPr>
-              <w:t xml:space="preserve">Voting, comments, chat</w:t>
+              <w:t xml:space="preserve">Voting (chat and comments deferred)</w:t>
             </w:r>
           </w:p>
         </w:tc>
@@ -1809,7 +1845,7 @@
                 <w:sz w:val="17"/>
                 <w:szCs w:val="17"/>
               </w:rPr>
-              <w:t xml:space="preserve">Yes (optional)</w:t>
+              <w:t xml:space="preserve">Deferred</w:t>
             </w:r>
           </w:p>
         </w:tc>
@@ -2018,7 +2054,7 @@
                 <w:sz w:val="17"/>
                 <w:szCs w:val="17"/>
               </w:rPr>
-              <w:t xml:space="preserve">Yes, changes plan with confirmation</w:t>
+              <w:t xml:space="preserve">Deferred; AI used only for route drafts with confirmation</w:t>
             </w:r>
           </w:p>
         </w:tc>
@@ -2227,7 +2263,7 @@
                 <w:sz w:val="17"/>
                 <w:szCs w:val="17"/>
               </w:rPr>
-              <w:t xml:space="preserve">Yes</w:t>
+              <w:t xml:space="preserve">Deferred</w:t>
             </w:r>
           </w:p>
         </w:tc>

</xml_diff>

<commit_message>
DIP-24: Reconcile final sources, role replies and evidence limits
</commit_message>
<xml_diff>
--- a/docs/existing-system-comparison.docx
+++ b/docs/existing-system-comparison.docx
@@ -158,7 +158,7 @@
           <w:sz w:val="24"/>
           <w:szCs w:val="24"/>
         </w:rPr>
-        <w:t xml:space="preserve">This document compares existing applications that solve parts of the collaborative trip planning problem, in order to show why the proposed solution is needed. Five systems were selected: three trip planners (Wanderlog, TripIt, Tripadvisor Trips), one AI-first travel planner (Mindtrip) and one expense-sharing application (Splitwise), because expense splitting is part of our scope. The systems are compared against eight criteria derived from our requirements.</w:t>
+        <w:t>This document compares existing applications that solve parts of the collaborative trip planning problem, in order to show why the proposed solution is needed. Five systems were selected: three trip planners (Wanderlog, TripIt, Tripadvisor Trips), one AI-first travel planner (Mindtrip) and one expense-sharing application (Splitwise), as a reference for a deferred expense-management option, rather than a mandatory MVP function. The systems are compared against eight criteria derived from our requirements.</w:t>
       </w:r>
     </w:p>
     <w:p>
@@ -2526,7 +2526,7 @@
           <w:sz w:val="24"/>
           <w:szCs w:val="24"/>
         </w:rPr>
-        <w:t xml:space="preserve">Wanderlog is the closest competitor. It supports real-time collaboration "like Google Docs", invitations by email or link, budgeting, expense tracking and bill splitting, offline access and a map with route optimization [1]. Its weaknesses for our target users are the lack of group decision tools such as voting, and the fact that it is a general global planner without local data for Kazakhstan; AI features are associated with the paid Pro plan [2].</w:t>
+        <w:t>Wanderlog is the closest competitor. It supports real-time collaboration "like Google Docs", invitations by email or link, budgeting, expense tracking and bill splitting, offline access and a map with route optimization [1]. The reviewed sources do not establish dedicated place voting or the quality of local Astana data. These remain verification questions, not proven missing capabilities. Source [2] discusses paid AI/automation features; entitlements require a dated product check.</w:t>
       </w:r>
     </w:p>
     <w:p>
@@ -2559,7 +2559,7 @@
           <w:sz w:val="24"/>
           <w:szCs w:val="24"/>
         </w:rPr>
-        <w:t xml:space="preserve">TripIt organizes trips by importing booking confirmations forwarded by email [4]. The Pro plan ($49 per year) adds sharing with an "Inner Circle", real-time flight alerts and airport maps [3]. TripIt is designed for travelers who have already booked everything; it does not help to choose places, distribute a budget or make group decisions.</w:t>
+        <w:t>TripIt organizes trips by importing booking confirmations forwarded by email [4]. The Pro plan ($49 per year) adds sharing with an "Inner Circle", real-time flight alerts and airport maps [3]. TripIt is designed for travelers who have already booked everything; the cited sources do not establish the complete place-selection, planned-budget and voting workflow proposed here.</w:t>
       </w:r>
     </w:p>
     <w:p>
@@ -2625,7 +2625,7 @@
           <w:sz w:val="24"/>
           <w:szCs w:val="24"/>
         </w:rPr>
-        <w:t xml:space="preserve">Mindtrip is an AI-first travel planner. Its group chat lets members discuss destinations, share favourite places and ask the @mindtrip bot for suggestions; the platform merges the preferences of all travelers into one itinerary [6][9]. It also adds up expenses from uploaded receipts and splits them between guests [7]. Mindtrip shows that AI combined with group chat is valued by users, but it is a global product and its data for Kazakhstan has not been verified.</w:t>
+        <w:t>Mindtrip is an AI-first travel planner. Its group chat lets members discuss destinations, share favourite places and ask the @mindtrip bot for suggestions; the platform merges the preferences of all travelers into one itinerary [6][9]. It also adds up expenses from uploaded receipts and splits them between guests [7]. Mindtrip provides a relevant example of AI combined with group chat; these descriptions alone do not measure user value or verify Kazakhstan data quality.</w:t>
       </w:r>
     </w:p>
     <w:p>
@@ -2696,7 +2696,7 @@
           <w:sz w:val="24"/>
           <w:szCs w:val="24"/>
         </w:rPr>
-        <w:t xml:space="preserve">No single system combines automatic budget-aware itinerary generation, group decision tools (voting and chat), expense splitting and an AI assistant.</w:t>
+        <w:t>The reviewed sources do not demonstrate which systems meet the complete five-outcome MVP under comparable Astana planning conditions. Missing evidence must not be treated as evidence of absence.</w:t>
       </w:r>
     </w:p>
     <w:p>
@@ -2717,7 +2717,7 @@
           <w:sz w:val="24"/>
           <w:szCs w:val="24"/>
         </w:rPr>
-        <w:t xml:space="preserve">Groups therefore use two or three applications at once (for example, a planner, Splitwise and a messenger), which is the problem our application addresses.</w:t>
+        <w:t>The survey reports use of several planning tools; it does not establish that every group uses a fixed number of applications. The MVP investigates whether one shared workflow supports planning and decisions.</w:t>
       </w:r>
     </w:p>
     <w:p>
@@ -2738,7 +2738,7 @@
           <w:sz w:val="24"/>
           <w:szCs w:val="24"/>
         </w:rPr>
-        <w:t xml:space="preserve">None of the reviewed sources indicates a focus on cities of Kazakhstan; our application starts with Astana and uses a database of places verified by local residents.</w:t>
+        <w:t>None of the reviewed sources indicates a focus on cities of Kazakhstan; the proposed application starts with Astana. Resident recommendations are candidate leads; production catalog verification remains planned.</w:t>
       </w:r>
     </w:p>
     <w:p>
@@ -2759,7 +2759,7 @@
           <w:sz w:val="24"/>
           <w:szCs w:val="24"/>
         </w:rPr>
-        <w:t xml:space="preserve">Our application is not unique in each separate feature; its value is in combining them in one simple, locally relevant product.</w:t>
+        <w:t>The proposed value is a catalog-grounded Astana workflow combining trip creation, draft generation, planned budgeting, map and shared editing/voting. Its usability and benefits remain hypotheses for the evaluation plan.</w:t>
       </w:r>
     </w:p>
     <w:p>
@@ -2993,7 +2993,7 @@
                 <w:sz w:val="18"/>
                 <w:szCs w:val="18"/>
               </w:rPr>
-              <w:t xml:space="preserve">Free-text AI input is becoming standard; our form (S3) combines structured fields (dates, travelers, budget) with the AI assistant for free-text changes.</w:t>
+              <w:t>Free-text AI input is becoming standard; our proposed form (S03) uses structured dates, traveler count, interests and budget; a conversational assistant is deferred.</w:t>
             </w:r>
           </w:p>
         </w:tc>
@@ -3086,7 +3086,7 @@
                 <w:sz w:val="18"/>
                 <w:szCs w:val="18"/>
               </w:rPr>
-              <w:t xml:space="preserve">Competitors monetize through bookable tours in large tourist cities; local Astana content is not shown. Our app focuses on verified local places.</w:t>
+              <w:t>Competitors monetize through bookable tours in large tourist cities; local Astana content is not shown. Our proposed app prioritizes an Astana catalog whose records still require verification.</w:t>
             </w:r>
           </w:p>
         </w:tc>
@@ -3179,7 +3179,7 @@
                 <w:sz w:val="18"/>
                 <w:szCs w:val="18"/>
               </w:rPr>
-              <w:t xml:space="preserve">Chat-first planning confirms the value of an AI assistant; the checklist has no explicit budget step and no group voting, which our app provides.</w:t>
+              <w:t>The captured checklist illustrates input design; it does not establish the product’s complete budget/voting capabilities or user value. Our planned budgeting and voting remain unimplemented product outcomes.</w:t>
             </w:r>
           </w:p>
         </w:tc>

</xml_diff>